<commit_message>
Collapse background and reduce coding to 2 lines focusing on the core concept: calculate delta q and update q
</commit_message>
<xml_diff>
--- a/lab03_inverse_kinematics/Lab03_Report_Template.docx
+++ b/lab03_inverse_kinematics/Lab03_Report_Template.docx
@@ -64,22 +64,8 @@
       <w:r>
         <w:rPr>
           <w:rFonts w:ascii="Arial" w:hAnsi="Arial"/>
-          <w:b/>
-          <w:i w:val="0"/>
-          <w:color w:val="000000"/>
-          <w:sz w:val="22"/>
         </w:rPr>
-        <w:t xml:space="preserve">Section or team: </w:t>
-      </w:r>
-      <w:r>
-        <w:rPr>
-          <w:rFonts w:ascii="Arial" w:hAnsi="Arial"/>
-          <w:b w:val="0"/>
-          <w:i w:val="0"/>
-          <w:color w:val="000000"/>
-          <w:sz w:val="22"/>
-        </w:rPr>
-        <w:t>____________________________________________________________</w:t>
+        <w:t>Section: ____________________________________________________________</w:t>
       </w:r>
     </w:p>
     <w:p>
@@ -114,10 +100,8 @@
       <w:r>
         <w:rPr>
           <w:rFonts w:ascii="Arial" w:hAnsi="Arial"/>
-          <w:b w:val="0"/>
-          <w:sz w:val="22"/>
         </w:rPr>
-        <w:t>Directions: Open this template in Microsoft Word. Before entering results, select File &gt; Save As and create a personal copy named LastName_Lab03_Report.docx. Replace the prompt text with your results. Paste output as text and add the required plots with Insert &gt; Pictures. Complete and submit your personal .docx copy.</w:t>
+        <w:t>Directions: Open this template in Microsoft Word and use File &gt; Save As to create LastName_Lab03_Report.docx. Complete the two equation lines in the source file, then paste the requested offline and Webots outputs below. Replace each prompt with your own results and insert the two requested screenshots.</w:t>
       </w:r>
     </w:p>
     <w:p>
@@ -125,71 +109,67 @@
         <w:pStyle w:val="Heading1"/>
       </w:pPr>
       <w:r>
-        <w:t>1. Planar IK</w:t>
+        <w:rPr>
+          <w:rFonts w:ascii="Arial" w:hAnsi="Arial"/>
+          <w:color w:val="000000"/>
+        </w:rPr>
+        <w:t>1. Numerical IK equations</w:t>
       </w:r>
     </w:p>
     <w:p>
-      <w:pPr>
-        <w:spacing w:before="100" w:after="60"/>
-      </w:pPr>
       <w:r>
         <w:rPr>
           <w:rFonts w:ascii="Arial" w:hAnsi="Arial"/>
-          <w:b/>
-          <w:i w:val="0"/>
-          <w:color w:val="000000"/>
           <w:sz w:val="22"/>
         </w:rPr>
-        <w:t>Test information</w:t>
+        <w:t>Enter the two Python lines you placed at TODO 1 and TODO 2 in src/numerical_ik.py.</w:t>
+      </w:r>
+    </w:p>
+    <w:p>
+      <w:r>
+        <w:rPr>
+          <w:rFonts w:ascii="Arial" w:hAnsi="Arial"/>
+          <w:sz w:val="22"/>
+        </w:rPr>
+        <w:t>TODO 1  Damped least squares</w:t>
       </w:r>
     </w:p>
     <w:tbl>
       <w:tblPr>
-        <w:tblW w:type="dxa" w:w="9360"/>
+        <w:tblW w:type="auto" w:w="0"/>
         <w:tblLayout w:type="fixed"/>
         <w:tblLook w:firstColumn="1" w:firstRow="1" w:lastColumn="0" w:lastRow="0" w:noHBand="0" w:noVBand="1" w:val="04A0"/>
-        <w:tblInd w:w="0" w:type="dxa"/>
-        <w:tblBorders>
-          <w:top w:val="single" w:sz="4" w:color="DADCE0"/>
-          <w:left w:val="single" w:sz="4" w:color="DADCE0"/>
-          <w:bottom w:val="single" w:sz="4" w:color="DADCE0"/>
-          <w:right w:val="single" w:sz="4" w:color="DADCE0"/>
-          <w:insideH w:val="nil"/>
-          <w:insideV w:val="nil"/>
-        </w:tblBorders>
       </w:tblPr>
       <w:tblGrid>
         <w:gridCol w:w="9360"/>
       </w:tblGrid>
       <w:tr>
         <w:trPr>
-          <w:trHeight w:val="2592" w:hRule="atLeast"/>
+          <w:trHeight w:val="792" w:hRule="atLeast"/>
         </w:trPr>
         <w:tc>
           <w:tcPr>
-            <w:tcW w:type="dxa" w:w="9360"/>
-            <w:tcMar>
-              <w:top w:w="100" w:type="dxa"/>
-              <w:bottom w:w="100" w:type="dxa"/>
-              <w:start w:w="120" w:type="dxa"/>
-              <w:end w:w="120" w:type="dxa"/>
-            </w:tcMar>
-            <w:vAlign w:val="top"/>
+            <w:tcW w:type="dxa" w:w="9288"/>
+            <w:vAlign w:val="center"/>
+            <w:tcBorders>
+              <w:top w:val="single" w:sz="8" w:color="D9D9D9"/>
+              <w:left w:val="single" w:sz="8" w:color="D9D9D9"/>
+              <w:bottom w:val="single" w:sz="8" w:color="D9D9D9"/>
+              <w:right w:val="single" w:sz="8" w:color="D9D9D9"/>
+            </w:tcBorders>
           </w:tcPr>
           <w:p>
             <w:pPr>
-              <w:spacing w:after="0"/>
               <w:jc w:val="left"/>
             </w:pPr>
             <w:r>
               <w:rPr>
-                <w:rFonts w:ascii="Consolas" w:hAnsi="Consolas"/>
-                <w:b w:val="0"/>
+                <w:rFonts w:ascii="Arial" w:hAnsi="Arial"/>
                 <w:i/>
-                <w:color w:val="555555"/>
-                <w:sz w:val="19"/>
+                <w:color w:val="595959"/>
+                <w:sz w:val="21"/>
               </w:rPr>
-              <w:t>State the link lengths and targets. Paste both interior-target branches, the boundary result, the unreachable-target result, and planar-FK verification.</w:t>
+              <w:t>Paste the completed step = ... line here.</w:t>
             </w:r>
           </w:p>
         </w:tc>
@@ -197,71 +177,187 @@
     </w:tbl>
     <w:p>
       <w:pPr>
-        <w:spacing w:before="100" w:after="60"/>
+        <w:spacing w:after="0"/>
       </w:pPr>
+    </w:p>
+    <w:p>
       <w:r>
         <w:rPr>
           <w:rFonts w:ascii="Arial" w:hAnsi="Arial"/>
-          <w:b/>
-          <w:i w:val="0"/>
-          <w:color w:val="000000"/>
           <w:sz w:val="22"/>
         </w:rPr>
-        <w:t>Physical interpretation</w:t>
+        <w:t>TODO 2  Joint update</w:t>
       </w:r>
     </w:p>
     <w:tbl>
       <w:tblPr>
-        <w:tblW w:type="dxa" w:w="9360"/>
+        <w:tblW w:type="auto" w:w="0"/>
         <w:tblLayout w:type="fixed"/>
         <w:tblLook w:firstColumn="1" w:firstRow="1" w:lastColumn="0" w:lastRow="0" w:noHBand="0" w:noVBand="1" w:val="04A0"/>
-        <w:tblInd w:w="0" w:type="dxa"/>
-        <w:tblBorders>
-          <w:top w:val="single" w:sz="4" w:color="DADCE0"/>
-          <w:left w:val="single" w:sz="4" w:color="DADCE0"/>
-          <w:bottom w:val="single" w:sz="4" w:color="DADCE0"/>
-          <w:right w:val="single" w:sz="4" w:color="DADCE0"/>
-          <w:insideH w:val="nil"/>
-          <w:insideV w:val="nil"/>
-        </w:tblBorders>
       </w:tblPr>
       <w:tblGrid>
         <w:gridCol w:w="9360"/>
       </w:tblGrid>
       <w:tr>
         <w:trPr>
-          <w:trHeight w:val="1152" w:hRule="atLeast"/>
+          <w:trHeight w:val="792" w:hRule="atLeast"/>
         </w:trPr>
         <w:tc>
           <w:tcPr>
-            <w:tcW w:type="dxa" w:w="9360"/>
-            <w:tcMar>
-              <w:top w:w="100" w:type="dxa"/>
-              <w:bottom w:w="100" w:type="dxa"/>
-              <w:start w:w="120" w:type="dxa"/>
-              <w:end w:w="120" w:type="dxa"/>
-            </w:tcMar>
-            <w:vAlign w:val="top"/>
+            <w:tcW w:type="dxa" w:w="9288"/>
+            <w:vAlign w:val="center"/>
+            <w:tcBorders>
+              <w:top w:val="single" w:sz="8" w:color="D9D9D9"/>
+              <w:left w:val="single" w:sz="8" w:color="D9D9D9"/>
+              <w:bottom w:val="single" w:sz="8" w:color="D9D9D9"/>
+              <w:right w:val="single" w:sz="8" w:color="D9D9D9"/>
+            </w:tcBorders>
           </w:tcPr>
           <w:p>
             <w:pPr>
-              <w:spacing w:after="0"/>
               <w:jc w:val="left"/>
             </w:pPr>
             <w:r>
               <w:rPr>
                 <w:rFonts w:ascii="Arial" w:hAnsi="Arial"/>
-                <w:b w:val="0"/>
                 <w:i/>
-                <w:color w:val="555555"/>
-                <w:sz w:val="20"/>
+                <w:color w:val="595959"/>
+                <w:sz w:val="21"/>
               </w:rPr>
-              <w:t>Explain what distinguishes the two branches physically.</w:t>
+              <w:t>Paste the completed q_proposed = ... line here.</w:t>
             </w:r>
           </w:p>
         </w:tc>
       </w:tr>
     </w:tbl>
+    <w:p>
+      <w:pPr>
+        <w:spacing w:after="0"/>
+      </w:pPr>
+    </w:p>
+    <w:p>
+      <w:pPr>
+        <w:pStyle w:val="Heading1"/>
+        <w:pageBreakBefore/>
+      </w:pPr>
+      <w:r>
+        <w:rPr>
+          <w:rFonts w:ascii="Arial" w:hAnsi="Arial"/>
+          <w:color w:val="000000"/>
+        </w:rPr>
+        <w:t>2. Offline IK results</w:t>
+      </w:r>
+    </w:p>
+    <w:p>
+      <w:r>
+        <w:rPr>
+          <w:rFonts w:ascii="Arial" w:hAnsi="Arial"/>
+          <w:sz w:val="22"/>
+        </w:rPr>
+        <w:t>Run the provided offline experiment. Paste the complete console output for Target A, Target B, and the unreachable target.</w:t>
+      </w:r>
+    </w:p>
+    <w:tbl>
+      <w:tblPr>
+        <w:tblW w:type="auto" w:w="0"/>
+        <w:tblLayout w:type="fixed"/>
+        <w:tblLook w:firstColumn="1" w:firstRow="1" w:lastColumn="0" w:lastRow="0" w:noHBand="0" w:noVBand="1" w:val="04A0"/>
+      </w:tblPr>
+      <w:tblGrid>
+        <w:gridCol w:w="9360"/>
+      </w:tblGrid>
+      <w:tr>
+        <w:trPr>
+          <w:trHeight w:val="4464" w:hRule="atLeast"/>
+        </w:trPr>
+        <w:tc>
+          <w:tcPr>
+            <w:tcW w:type="dxa" w:w="9288"/>
+            <w:vAlign w:val="center"/>
+            <w:tcBorders>
+              <w:top w:val="single" w:sz="8" w:color="D9D9D9"/>
+              <w:left w:val="single" w:sz="8" w:color="D9D9D9"/>
+              <w:bottom w:val="single" w:sz="8" w:color="D9D9D9"/>
+              <w:right w:val="single" w:sz="8" w:color="D9D9D9"/>
+            </w:tcBorders>
+          </w:tcPr>
+          <w:p>
+            <w:pPr>
+              <w:jc w:val="left"/>
+            </w:pPr>
+            <w:r>
+              <w:rPr>
+                <w:rFonts w:ascii="Arial" w:hAnsi="Arial"/>
+                <w:i/>
+                <w:color w:val="595959"/>
+                <w:sz w:val="21"/>
+              </w:rPr>
+              <w:t>Paste the complete output from run_ik_experiments.py here.</w:t>
+            </w:r>
+          </w:p>
+        </w:tc>
+      </w:tr>
+    </w:tbl>
+    <w:p>
+      <w:pPr>
+        <w:spacing w:after="0"/>
+      </w:pPr>
+    </w:p>
+    <w:p>
+      <w:r>
+        <w:rPr>
+          <w:rFonts w:ascii="Arial" w:hAnsi="Arial"/>
+          <w:sz w:val="22"/>
+        </w:rPr>
+        <w:t>In one or two sentences, explain why converged = False is the correct result for the unreachable target.</w:t>
+      </w:r>
+    </w:p>
+    <w:tbl>
+      <w:tblPr>
+        <w:tblW w:type="auto" w:w="0"/>
+        <w:tblLayout w:type="fixed"/>
+        <w:tblLook w:firstColumn="1" w:firstRow="1" w:lastColumn="0" w:lastRow="0" w:noHBand="0" w:noVBand="1" w:val="04A0"/>
+      </w:tblPr>
+      <w:tblGrid>
+        <w:gridCol w:w="9360"/>
+      </w:tblGrid>
+      <w:tr>
+        <w:trPr>
+          <w:trHeight w:val="1296" w:hRule="atLeast"/>
+        </w:trPr>
+        <w:tc>
+          <w:tcPr>
+            <w:tcW w:type="dxa" w:w="9288"/>
+            <w:vAlign w:val="center"/>
+            <w:tcBorders>
+              <w:top w:val="single" w:sz="8" w:color="D9D9D9"/>
+              <w:left w:val="single" w:sz="8" w:color="D9D9D9"/>
+              <w:bottom w:val="single" w:sz="8" w:color="D9D9D9"/>
+              <w:right w:val="single" w:sz="8" w:color="D9D9D9"/>
+            </w:tcBorders>
+          </w:tcPr>
+          <w:p>
+            <w:pPr>
+              <w:jc w:val="left"/>
+            </w:pPr>
+            <w:r>
+              <w:rPr>
+                <w:rFonts w:ascii="Arial" w:hAnsi="Arial"/>
+                <w:i/>
+                <w:color w:val="595959"/>
+                <w:sz w:val="21"/>
+              </w:rPr>
+              <w:t>Type your explanation here.</w:t>
+            </w:r>
+          </w:p>
+        </w:tc>
+      </w:tr>
+    </w:tbl>
+    <w:p>
+      <w:pPr>
+        <w:spacing w:after="0"/>
+      </w:pPr>
+    </w:p>
     <w:p>
       <w:r>
         <w:br w:type="page"/>
@@ -272,71 +368,58 @@
         <w:pStyle w:val="Heading1"/>
       </w:pPr>
       <w:r>
-        <w:t>2. Pose error and finite-difference Jacobian</w:t>
+        <w:rPr>
+          <w:rFonts w:ascii="Arial" w:hAnsi="Arial"/>
+          <w:color w:val="000000"/>
+        </w:rPr>
+        <w:t>3. Target A Webots result</w:t>
       </w:r>
     </w:p>
     <w:p>
-      <w:pPr>
-        <w:spacing w:before="100" w:after="60"/>
-      </w:pPr>
       <w:r>
         <w:rPr>
           <w:rFonts w:ascii="Arial" w:hAnsi="Arial"/>
-          <w:b/>
-          <w:i w:val="0"/>
-          <w:color w:val="000000"/>
           <w:sz w:val="22"/>
         </w:rPr>
-        <w:t>Test results</w:t>
+        <w:t>Paste the controller output. It must include the predicted tool position and RPY from FK and the Webots-measured tool position and RPY.</w:t>
       </w:r>
     </w:p>
     <w:tbl>
       <w:tblPr>
-        <w:tblW w:type="dxa" w:w="9360"/>
+        <w:tblW w:type="auto" w:w="0"/>
         <w:tblLayout w:type="fixed"/>
         <w:tblLook w:firstColumn="1" w:firstRow="1" w:lastColumn="0" w:lastRow="0" w:noHBand="0" w:noVBand="1" w:val="04A0"/>
-        <w:tblInd w:w="0" w:type="dxa"/>
-        <w:tblBorders>
-          <w:top w:val="single" w:sz="4" w:color="DADCE0"/>
-          <w:left w:val="single" w:sz="4" w:color="DADCE0"/>
-          <w:bottom w:val="single" w:sz="4" w:color="DADCE0"/>
-          <w:right w:val="single" w:sz="4" w:color="DADCE0"/>
-          <w:insideH w:val="nil"/>
-          <w:insideV w:val="nil"/>
-        </w:tblBorders>
       </w:tblPr>
       <w:tblGrid>
         <w:gridCol w:w="9360"/>
       </w:tblGrid>
       <w:tr>
         <w:trPr>
-          <w:trHeight w:val="2880" w:hRule="atLeast"/>
+          <w:trHeight w:val="2160" w:hRule="atLeast"/>
         </w:trPr>
         <w:tc>
           <w:tcPr>
-            <w:tcW w:type="dxa" w:w="9360"/>
-            <w:tcMar>
-              <w:top w:w="100" w:type="dxa"/>
-              <w:bottom w:w="100" w:type="dxa"/>
-              <w:start w:w="120" w:type="dxa"/>
-              <w:end w:w="120" w:type="dxa"/>
-            </w:tcMar>
-            <w:vAlign w:val="top"/>
+            <w:tcW w:type="dxa" w:w="9288"/>
+            <w:vAlign w:val="center"/>
+            <w:tcBorders>
+              <w:top w:val="single" w:sz="8" w:color="D9D9D9"/>
+              <w:left w:val="single" w:sz="8" w:color="D9D9D9"/>
+              <w:bottom w:val="single" w:sz="8" w:color="D9D9D9"/>
+              <w:right w:val="single" w:sz="8" w:color="D9D9D9"/>
+            </w:tcBorders>
           </w:tcPr>
           <w:p>
             <w:pPr>
-              <w:spacing w:after="0"/>
               <w:jc w:val="left"/>
             </w:pPr>
             <w:r>
               <w:rPr>
-                <w:rFonts w:ascii="Consolas" w:hAnsi="Consolas"/>
-                <w:b w:val="0"/>
+                <w:rFonts w:ascii="Arial" w:hAnsi="Arial"/>
                 <w:i/>
-                <w:color w:val="555555"/>
-                <w:sz w:val="19"/>
+                <w:color w:val="595959"/>
+                <w:sz w:val="21"/>
               </w:rPr>
-              <w:t>State the rotational-error frame. Paste the identity, translation-sign, rotation-sign, shape, and finite-value checks, followed by the h = 1e-3 through 1e-6 study.</w:t>
+              <w:t>Paste the complete Target A controller output here.</w:t>
             </w:r>
           </w:p>
         </w:tc>
@@ -344,71 +427,119 @@
     </w:tbl>
     <w:p>
       <w:pPr>
-        <w:spacing w:before="100" w:after="60"/>
+        <w:spacing w:after="0"/>
       </w:pPr>
+    </w:p>
+    <w:p>
       <w:r>
         <w:rPr>
           <w:rFonts w:ascii="Arial" w:hAnsi="Arial"/>
-          <w:b/>
-          <w:i w:val="0"/>
-          <w:color w:val="000000"/>
           <w:sz w:val="22"/>
         </w:rPr>
-        <w:t>Selected step size</w:t>
+        <w:t>Screenshot</w:t>
       </w:r>
     </w:p>
     <w:tbl>
       <w:tblPr>
-        <w:tblW w:type="dxa" w:w="9360"/>
+        <w:tblW w:type="auto" w:w="0"/>
         <w:tblLayout w:type="fixed"/>
         <w:tblLook w:firstColumn="1" w:firstRow="1" w:lastColumn="0" w:lastRow="0" w:noHBand="0" w:noVBand="1" w:val="04A0"/>
-        <w:tblInd w:w="0" w:type="dxa"/>
-        <w:tblBorders>
-          <w:top w:val="single" w:sz="4" w:color="DADCE0"/>
-          <w:left w:val="single" w:sz="4" w:color="DADCE0"/>
-          <w:bottom w:val="single" w:sz="4" w:color="DADCE0"/>
-          <w:right w:val="single" w:sz="4" w:color="DADCE0"/>
-          <w:insideH w:val="nil"/>
-          <w:insideV w:val="nil"/>
-        </w:tblBorders>
       </w:tblPr>
       <w:tblGrid>
         <w:gridCol w:w="9360"/>
       </w:tblGrid>
       <w:tr>
         <w:trPr>
-          <w:trHeight w:val="936" w:hRule="atLeast"/>
+          <w:trHeight w:val="3600" w:hRule="atLeast"/>
         </w:trPr>
         <w:tc>
           <w:tcPr>
-            <w:tcW w:type="dxa" w:w="9360"/>
-            <w:tcMar>
-              <w:top w:w="100" w:type="dxa"/>
-              <w:bottom w:w="100" w:type="dxa"/>
-              <w:start w:w="120" w:type="dxa"/>
-              <w:end w:w="120" w:type="dxa"/>
-            </w:tcMar>
-            <w:vAlign w:val="top"/>
+            <w:tcW w:type="dxa" w:w="9288"/>
+            <w:vAlign w:val="center"/>
+            <w:tcBorders>
+              <w:top w:val="single" w:sz="8" w:color="D9D9D9"/>
+              <w:left w:val="single" w:sz="8" w:color="D9D9D9"/>
+              <w:bottom w:val="single" w:sz="8" w:color="D9D9D9"/>
+              <w:right w:val="single" w:sz="8" w:color="D9D9D9"/>
+            </w:tcBorders>
           </w:tcPr>
           <w:p>
             <w:pPr>
-              <w:spacing w:after="0"/>
+              <w:jc w:val="center"/>
+            </w:pPr>
+            <w:r>
+              <w:rPr>
+                <w:rFonts w:ascii="Arial" w:hAnsi="Arial"/>
+                <w:i/>
+                <w:color w:val="595959"/>
+                <w:sz w:val="21"/>
+              </w:rPr>
+              <w:t>Insert one screenshot showing the final robot pose and Target A.</w:t>
+            </w:r>
+          </w:p>
+        </w:tc>
+      </w:tr>
+    </w:tbl>
+    <w:p>
+      <w:pPr>
+        <w:spacing w:after="0"/>
+      </w:pPr>
+    </w:p>
+    <w:p>
+      <w:r>
+        <w:rPr>
+          <w:rFonts w:ascii="Arial" w:hAnsi="Arial"/>
+          <w:sz w:val="22"/>
+        </w:rPr>
+        <w:t>Compare Target A pose by pose: do the predicted and measured tool position agree closely, and do the predicted and measured tool RPY agree closely?</w:t>
+      </w:r>
+    </w:p>
+    <w:tbl>
+      <w:tblPr>
+        <w:tblW w:type="auto" w:w="0"/>
+        <w:tblLayout w:type="fixed"/>
+        <w:tblLook w:firstColumn="1" w:firstRow="1" w:lastColumn="0" w:lastRow="0" w:noHBand="0" w:noVBand="1" w:val="04A0"/>
+      </w:tblPr>
+      <w:tblGrid>
+        <w:gridCol w:w="9360"/>
+      </w:tblGrid>
+      <w:tr>
+        <w:trPr>
+          <w:trHeight w:val="1296" w:hRule="atLeast"/>
+        </w:trPr>
+        <w:tc>
+          <w:tcPr>
+            <w:tcW w:type="dxa" w:w="9288"/>
+            <w:vAlign w:val="center"/>
+            <w:tcBorders>
+              <w:top w:val="single" w:sz="8" w:color="D9D9D9"/>
+              <w:left w:val="single" w:sz="8" w:color="D9D9D9"/>
+              <w:bottom w:val="single" w:sz="8" w:color="D9D9D9"/>
+              <w:right w:val="single" w:sz="8" w:color="D9D9D9"/>
+            </w:tcBorders>
+          </w:tcPr>
+          <w:p>
+            <w:pPr>
               <w:jc w:val="left"/>
             </w:pPr>
             <w:r>
               <w:rPr>
                 <w:rFonts w:ascii="Arial" w:hAnsi="Arial"/>
-                <w:b w:val="0"/>
                 <w:i/>
-                <w:color w:val="555555"/>
-                <w:sz w:val="20"/>
+                <w:color w:val="595959"/>
+                <w:sz w:val="21"/>
               </w:rPr>
-              <w:t>State the selected finite-difference h and briefly justify it.</w:t>
+              <w:t>Write 1-2 sentences about Target A here.</w:t>
             </w:r>
           </w:p>
         </w:tc>
       </w:tr>
     </w:tbl>
+    <w:p>
+      <w:pPr>
+        <w:spacing w:after="0"/>
+      </w:pPr>
+    </w:p>
     <w:p>
       <w:r>
         <w:br w:type="page"/>
@@ -419,71 +550,58 @@
         <w:pStyle w:val="Heading1"/>
       </w:pPr>
       <w:r>
-        <w:t>3. Numerical IK settings and safeguards</w:t>
+        <w:rPr>
+          <w:rFonts w:ascii="Arial" w:hAnsi="Arial"/>
+          <w:color w:val="000000"/>
+        </w:rPr>
+        <w:t>4. Target B Webots result</w:t>
       </w:r>
     </w:p>
     <w:p>
-      <w:pPr>
-        <w:spacing w:before="100" w:after="60"/>
-      </w:pPr>
       <w:r>
         <w:rPr>
           <w:rFonts w:ascii="Arial" w:hAnsi="Arial"/>
-          <w:b/>
-          <w:i w:val="0"/>
-          <w:color w:val="000000"/>
           <w:sz w:val="22"/>
         </w:rPr>
-        <w:t>Settings</w:t>
+        <w:t>Paste the controller output. It must include the predicted tool position and RPY from FK and the Webots-measured tool position and RPY.</w:t>
       </w:r>
     </w:p>
     <w:tbl>
       <w:tblPr>
-        <w:tblW w:type="dxa" w:w="9360"/>
+        <w:tblW w:type="auto" w:w="0"/>
         <w:tblLayout w:type="fixed"/>
         <w:tblLook w:firstColumn="1" w:firstRow="1" w:lastColumn="0" w:lastRow="0" w:noHBand="0" w:noVBand="1" w:val="04A0"/>
-        <w:tblInd w:w="0" w:type="dxa"/>
-        <w:tblBorders>
-          <w:top w:val="single" w:sz="4" w:color="DADCE0"/>
-          <w:left w:val="single" w:sz="4" w:color="DADCE0"/>
-          <w:bottom w:val="single" w:sz="4" w:color="DADCE0"/>
-          <w:right w:val="single" w:sz="4" w:color="DADCE0"/>
-          <w:insideH w:val="nil"/>
-          <w:insideV w:val="nil"/>
-        </w:tblBorders>
       </w:tblPr>
       <w:tblGrid>
         <w:gridCol w:w="9360"/>
       </w:tblGrid>
       <w:tr>
         <w:trPr>
-          <w:trHeight w:val="1872" w:hRule="atLeast"/>
+          <w:trHeight w:val="2160" w:hRule="atLeast"/>
         </w:trPr>
         <w:tc>
           <w:tcPr>
-            <w:tcW w:type="dxa" w:w="9360"/>
-            <w:tcMar>
-              <w:top w:w="100" w:type="dxa"/>
-              <w:bottom w:w="100" w:type="dxa"/>
-              <w:start w:w="120" w:type="dxa"/>
-              <w:end w:w="120" w:type="dxa"/>
-            </w:tcMar>
-            <w:vAlign w:val="top"/>
+            <w:tcW w:type="dxa" w:w="9288"/>
+            <w:vAlign w:val="center"/>
+            <w:tcBorders>
+              <w:top w:val="single" w:sz="8" w:color="D9D9D9"/>
+              <w:left w:val="single" w:sz="8" w:color="D9D9D9"/>
+              <w:bottom w:val="single" w:sz="8" w:color="D9D9D9"/>
+              <w:right w:val="single" w:sz="8" w:color="D9D9D9"/>
+            </w:tcBorders>
           </w:tcPr>
           <w:p>
             <w:pPr>
-              <w:spacing w:after="0"/>
               <w:jc w:val="left"/>
             </w:pPr>
             <w:r>
               <w:rPr>
-                <w:rFonts w:ascii="Consolas" w:hAnsi="Consolas"/>
-                <w:b w:val="0"/>
+                <w:rFonts w:ascii="Arial" w:hAnsi="Arial"/>
                 <w:i/>
-                <w:color w:val="555555"/>
-                <w:sz w:val="19"/>
+                <w:color w:val="595959"/>
+                <w:sz w:val="21"/>
               </w:rPr>
-              <w:t>Paste alpha, damping, maximum joint step, position and orientation tolerances, maximum iterations, and joint limits.</w:t>
+              <w:t>Paste the complete Target B controller output here.</w:t>
             </w:r>
           </w:p>
         </w:tc>
@@ -491,146 +609,54 @@
     </w:tbl>
     <w:p>
       <w:pPr>
-        <w:spacing w:before="100" w:after="60"/>
+        <w:spacing w:after="0"/>
       </w:pPr>
+    </w:p>
+    <w:p>
       <w:r>
         <w:rPr>
           <w:rFonts w:ascii="Arial" w:hAnsi="Arial"/>
-          <w:b/>
-          <w:i w:val="0"/>
-          <w:color w:val="000000"/>
           <w:sz w:val="22"/>
         </w:rPr>
-        <w:t>Failure guards</w:t>
+        <w:t>Screenshot</w:t>
       </w:r>
     </w:p>
     <w:tbl>
       <w:tblPr>
-        <w:tblW w:type="dxa" w:w="9360"/>
+        <w:tblW w:type="auto" w:w="0"/>
         <w:tblLayout w:type="fixed"/>
         <w:tblLook w:firstColumn="1" w:firstRow="1" w:lastColumn="0" w:lastRow="0" w:noHBand="0" w:noVBand="1" w:val="04A0"/>
-        <w:tblInd w:w="0" w:type="dxa"/>
-        <w:tblBorders>
-          <w:top w:val="single" w:sz="4" w:color="DADCE0"/>
-          <w:left w:val="single" w:sz="4" w:color="DADCE0"/>
-          <w:bottom w:val="single" w:sz="4" w:color="DADCE0"/>
-          <w:right w:val="single" w:sz="4" w:color="DADCE0"/>
-          <w:insideH w:val="nil"/>
-          <w:insideV w:val="nil"/>
-        </w:tblBorders>
       </w:tblPr>
       <w:tblGrid>
         <w:gridCol w:w="9360"/>
       </w:tblGrid>
       <w:tr>
         <w:trPr>
-          <w:trHeight w:val="1440" w:hRule="atLeast"/>
+          <w:trHeight w:val="3600" w:hRule="atLeast"/>
         </w:trPr>
         <w:tc>
           <w:tcPr>
-            <w:tcW w:type="dxa" w:w="9360"/>
-            <w:tcMar>
-              <w:top w:w="100" w:type="dxa"/>
-              <w:bottom w:w="100" w:type="dxa"/>
-              <w:start w:w="120" w:type="dxa"/>
-              <w:end w:w="120" w:type="dxa"/>
-            </w:tcMar>
-            <w:vAlign w:val="top"/>
+            <w:tcW w:type="dxa" w:w="9288"/>
+            <w:vAlign w:val="center"/>
+            <w:tcBorders>
+              <w:top w:val="single" w:sz="8" w:color="D9D9D9"/>
+              <w:left w:val="single" w:sz="8" w:color="D9D9D9"/>
+              <w:bottom w:val="single" w:sz="8" w:color="D9D9D9"/>
+              <w:right w:val="single" w:sz="8" w:color="D9D9D9"/>
+            </w:tcBorders>
           </w:tcPr>
           <w:p>
             <w:pPr>
-              <w:spacing w:after="0"/>
-              <w:jc w:val="left"/>
+              <w:jc w:val="center"/>
             </w:pPr>
             <w:r>
               <w:rPr>
                 <w:rFonts w:ascii="Arial" w:hAnsi="Arial"/>
-                <w:b w:val="0"/>
                 <w:i/>
-                <w:color w:val="555555"/>
-                <w:sz w:val="20"/>
+                <w:color w:val="595959"/>
+                <w:sz w:val="21"/>
               </w:rPr>
-              <w:t>List the solver failure guards and explain why both pose tolerances must pass.</w:t>
-            </w:r>
-          </w:p>
-        </w:tc>
-      </w:tr>
-    </w:tbl>
-    <w:p>
-      <w:r>
-        <w:br w:type="page"/>
-      </w:r>
-    </w:p>
-    <w:p>
-      <w:pPr>
-        <w:pStyle w:val="Heading1"/>
-      </w:pPr>
-      <w:r>
-        <w:t>4. Target, seed, and failure results</w:t>
-      </w:r>
-    </w:p>
-    <w:p>
-      <w:pPr>
-        <w:spacing w:before="100" w:after="60"/>
-      </w:pPr>
-      <w:r>
-        <w:rPr>
-          <w:rFonts w:ascii="Arial" w:hAnsi="Arial"/>
-          <w:b/>
-          <w:i w:val="0"/>
-          <w:color w:val="000000"/>
-          <w:sz w:val="22"/>
-        </w:rPr>
-        <w:t>Frame check</w:t>
-      </w:r>
-    </w:p>
-    <w:tbl>
-      <w:tblPr>
-        <w:tblW w:type="dxa" w:w="9360"/>
-        <w:tblLayout w:type="fixed"/>
-        <w:tblLook w:firstColumn="1" w:firstRow="1" w:lastColumn="0" w:lastRow="0" w:noHBand="0" w:noVBand="1" w:val="04A0"/>
-        <w:tblInd w:w="0" w:type="dxa"/>
-        <w:tblBorders>
-          <w:top w:val="single" w:sz="4" w:color="DADCE0"/>
-          <w:left w:val="single" w:sz="4" w:color="DADCE0"/>
-          <w:bottom w:val="single" w:sz="4" w:color="DADCE0"/>
-          <w:right w:val="single" w:sz="4" w:color="DADCE0"/>
-          <w:insideH w:val="nil"/>
-          <w:insideV w:val="nil"/>
-        </w:tblBorders>
-      </w:tblPr>
-      <w:tblGrid>
-        <w:gridCol w:w="9360"/>
-      </w:tblGrid>
-      <w:tr>
-        <w:trPr>
-          <w:trHeight w:val="1152" w:hRule="atLeast"/>
-        </w:trPr>
-        <w:tc>
-          <w:tcPr>
-            <w:tcW w:type="dxa" w:w="9360"/>
-            <w:tcMar>
-              <w:top w:w="100" w:type="dxa"/>
-              <w:bottom w:w="100" w:type="dxa"/>
-              <w:start w:w="120" w:type="dxa"/>
-              <w:end w:w="120" w:type="dxa"/>
-            </w:tcMar>
-            <w:vAlign w:val="top"/>
-          </w:tcPr>
-          <w:p>
-            <w:pPr>
-              <w:spacing w:after="0"/>
-              <w:jc w:val="left"/>
-            </w:pPr>
-            <w:r>
-              <w:rPr>
-                <w:rFonts w:ascii="Consolas" w:hAnsi="Consolas"/>
-                <w:b w:val="0"/>
-                <w:i/>
-                <w:color w:val="555555"/>
-                <w:sz w:val="19"/>
-              </w:rPr>
-              <w:t>Record the fixed T_6_TOOL and confirm that fk_tool uses forward_kinematics(q) @ T_6_TOOL without recalibration.</w:t>
+              <w:t>Insert one screenshot showing the final robot pose and Target B.</w:t>
             </w:r>
           </w:p>
         </w:tc>
@@ -638,66 +664,54 @@
     </w:tbl>
     <w:p>
       <w:pPr>
-        <w:spacing w:before="100" w:after="60"/>
+        <w:spacing w:after="0"/>
       </w:pPr>
+    </w:p>
+    <w:p>
       <w:r>
         <w:rPr>
           <w:rFonts w:ascii="Arial" w:hAnsi="Arial"/>
-          <w:b/>
-          <w:i w:val="0"/>
-          <w:color w:val="000000"/>
           <w:sz w:val="22"/>
         </w:rPr>
-        <w:t>Solver results</w:t>
+        <w:t>Compare Target B pose by pose: do the predicted and measured tool position agree closely, and do the predicted and measured tool RPY agree closely?</w:t>
       </w:r>
     </w:p>
     <w:tbl>
       <w:tblPr>
-        <w:tblW w:type="dxa" w:w="9360"/>
+        <w:tblW w:type="auto" w:w="0"/>
         <w:tblLayout w:type="fixed"/>
         <w:tblLook w:firstColumn="1" w:firstRow="1" w:lastColumn="0" w:lastRow="0" w:noHBand="0" w:noVBand="1" w:val="04A0"/>
-        <w:tblInd w:w="0" w:type="dxa"/>
-        <w:tblBorders>
-          <w:top w:val="single" w:sz="4" w:color="DADCE0"/>
-          <w:left w:val="single" w:sz="4" w:color="DADCE0"/>
-          <w:bottom w:val="single" w:sz="4" w:color="DADCE0"/>
-          <w:right w:val="single" w:sz="4" w:color="DADCE0"/>
-          <w:insideH w:val="nil"/>
-          <w:insideV w:val="nil"/>
-        </w:tblBorders>
       </w:tblPr>
       <w:tblGrid>
         <w:gridCol w:w="9360"/>
       </w:tblGrid>
       <w:tr>
         <w:trPr>
-          <w:trHeight w:val="2880" w:hRule="atLeast"/>
+          <w:trHeight w:val="1296" w:hRule="atLeast"/>
         </w:trPr>
         <w:tc>
           <w:tcPr>
-            <w:tcW w:type="dxa" w:w="9360"/>
-            <w:tcMar>
-              <w:top w:w="100" w:type="dxa"/>
-              <w:bottom w:w="100" w:type="dxa"/>
-              <w:start w:w="120" w:type="dxa"/>
-              <w:end w:w="120" w:type="dxa"/>
-            </w:tcMar>
-            <w:vAlign w:val="top"/>
+            <w:tcW w:type="dxa" w:w="9288"/>
+            <w:vAlign w:val="center"/>
+            <w:tcBorders>
+              <w:top w:val="single" w:sz="8" w:color="D9D9D9"/>
+              <w:left w:val="single" w:sz="8" w:color="D9D9D9"/>
+              <w:bottom w:val="single" w:sz="8" w:color="D9D9D9"/>
+              <w:right w:val="single" w:sz="8" w:color="D9D9D9"/>
+            </w:tcBorders>
           </w:tcPr>
           <w:p>
             <w:pPr>
-              <w:spacing w:after="0"/>
               <w:jc w:val="left"/>
             </w:pPr>
             <w:r>
               <w:rPr>
-                <w:rFonts w:ascii="Consolas" w:hAnsi="Consolas"/>
-                <w:b w:val="0"/>
+                <w:rFonts w:ascii="Arial" w:hAnsi="Arial"/>
                 <w:i/>
-                <w:color w:val="555555"/>
-                <w:sz w:val="19"/>
+                <w:color w:val="595959"/>
+                <w:sz w:val="21"/>
               </w:rPr>
-              <w:t>Paste the Target A, Target B, multiple-seed, and unreachable-target results, including convergence reason, iterations, residuals, final q, and acceptance decision.</w:t>
+              <w:t>Write 1-2 sentences about Target B here.</w:t>
             </w:r>
           </w:p>
         </w:tc>
@@ -705,247 +719,36 @@
     </w:tbl>
     <w:p>
       <w:pPr>
-        <w:spacing w:before="100" w:after="60"/>
+        <w:spacing w:after="0"/>
+      </w:pPr>
+    </w:p>
+    <w:p>
+      <w:pPr>
+        <w:pStyle w:val="Heading1"/>
+        <w:pageBreakBefore/>
       </w:pPr>
       <w:r>
         <w:rPr>
           <w:rFonts w:ascii="Arial" w:hAnsi="Arial"/>
-          <w:b/>
-          <w:i w:val="0"/>
           <w:color w:val="000000"/>
+        </w:rPr>
+        <w:t>5. Engineering questions</w:t>
+      </w:r>
+    </w:p>
+    <w:p>
+      <w:r>
+        <w:rPr>
+          <w:rFonts w:ascii="Arial" w:hAnsi="Arial"/>
           <w:sz w:val="22"/>
         </w:rPr>
-        <w:t>Residual plots</w:t>
+        <w:t>1. In one iteration, how does the pose-error vector influence the joint correction?</w:t>
       </w:r>
     </w:p>
     <w:tbl>
       <w:tblPr>
-        <w:tblW w:type="dxa" w:w="9360"/>
+        <w:tblW w:type="auto" w:w="0"/>
         <w:tblLayout w:type="fixed"/>
         <w:tblLook w:firstColumn="1" w:firstRow="1" w:lastColumn="0" w:lastRow="0" w:noHBand="0" w:noVBand="1" w:val="04A0"/>
-        <w:tblInd w:w="0" w:type="dxa"/>
-        <w:tblBorders>
-          <w:top w:val="single" w:sz="4" w:color="DADCE0"/>
-          <w:left w:val="single" w:sz="4" w:color="DADCE0"/>
-          <w:bottom w:val="single" w:sz="4" w:color="DADCE0"/>
-          <w:right w:val="single" w:sz="4" w:color="DADCE0"/>
-          <w:insideH w:val="nil"/>
-          <w:insideV w:val="nil"/>
-        </w:tblBorders>
-      </w:tblPr>
-      <w:tblGrid>
-        <w:gridCol w:w="9360"/>
-      </w:tblGrid>
-      <w:tr>
-        <w:trPr>
-          <w:trHeight w:val="2880" w:hRule="atLeast"/>
-        </w:trPr>
-        <w:tc>
-          <w:tcPr>
-            <w:tcW w:type="dxa" w:w="9360"/>
-            <w:tcMar>
-              <w:top w:w="100" w:type="dxa"/>
-              <w:bottom w:w="100" w:type="dxa"/>
-              <w:start w:w="120" w:type="dxa"/>
-              <w:end w:w="120" w:type="dxa"/>
-            </w:tcMar>
-            <w:vAlign w:val="center"/>
-          </w:tcPr>
-          <w:p>
-            <w:pPr>
-              <w:spacing w:after="0"/>
-              <w:jc w:val="center"/>
-            </w:pPr>
-            <w:r>
-              <w:rPr>
-                <w:rFonts w:ascii="Arial" w:hAnsi="Arial"/>
-                <w:b w:val="0"/>
-                <w:i/>
-                <w:color w:val="555555"/>
-                <w:sz w:val="20"/>
-              </w:rPr>
-              <w:t>Insert the fast-run, slower or different-seed, and unreachable-run residual plots.</w:t>
-            </w:r>
-          </w:p>
-        </w:tc>
-      </w:tr>
-    </w:tbl>
-    <w:p>
-      <w:pPr>
-        <w:spacing w:before="100" w:after="60"/>
-      </w:pPr>
-      <w:r>
-        <w:rPr>
-          <w:rFonts w:ascii="Arial" w:hAnsi="Arial"/>
-          <w:b/>
-          <w:i w:val="0"/>
-          <w:color w:val="000000"/>
-          <w:sz w:val="22"/>
-        </w:rPr>
-        <w:t>Safety decision</w:t>
-      </w:r>
-    </w:p>
-    <w:tbl>
-      <w:tblPr>
-        <w:tblW w:type="dxa" w:w="9360"/>
-        <w:tblLayout w:type="fixed"/>
-        <w:tblLook w:firstColumn="1" w:firstRow="1" w:lastColumn="0" w:lastRow="0" w:noHBand="0" w:noVBand="1" w:val="04A0"/>
-        <w:tblInd w:w="0" w:type="dxa"/>
-        <w:tblBorders>
-          <w:top w:val="single" w:sz="4" w:color="DADCE0"/>
-          <w:left w:val="single" w:sz="4" w:color="DADCE0"/>
-          <w:bottom w:val="single" w:sz="4" w:color="DADCE0"/>
-          <w:right w:val="single" w:sz="4" w:color="DADCE0"/>
-          <w:insideH w:val="nil"/>
-          <w:insideV w:val="nil"/>
-        </w:tblBorders>
-      </w:tblPr>
-      <w:tblGrid>
-        <w:gridCol w:w="9360"/>
-      </w:tblGrid>
-      <w:tr>
-        <w:trPr>
-          <w:trHeight w:val="1080" w:hRule="atLeast"/>
-        </w:trPr>
-        <w:tc>
-          <w:tcPr>
-            <w:tcW w:type="dxa" w:w="9360"/>
-            <w:tcMar>
-              <w:top w:w="100" w:type="dxa"/>
-              <w:bottom w:w="100" w:type="dxa"/>
-              <w:start w:w="120" w:type="dxa"/>
-              <w:end w:w="120" w:type="dxa"/>
-            </w:tcMar>
-            <w:vAlign w:val="top"/>
-          </w:tcPr>
-          <w:p>
-            <w:pPr>
-              <w:spacing w:after="0"/>
-              <w:jc w:val="left"/>
-            </w:pPr>
-            <w:r>
-              <w:rPr>
-                <w:rFonts w:ascii="Arial" w:hAnsi="Arial"/>
-                <w:b w:val="0"/>
-                <w:i/>
-                <w:color w:val="555555"/>
-                <w:sz w:val="20"/>
-              </w:rPr>
-              <w:t>Explain why the selected Target A and B solutions are safe to execute.</w:t>
-            </w:r>
-          </w:p>
-        </w:tc>
-      </w:tr>
-    </w:tbl>
-    <w:p>
-      <w:r>
-        <w:br w:type="page"/>
-      </w:r>
-    </w:p>
-    <w:p>
-      <w:pPr>
-        <w:pStyle w:val="Heading1"/>
-      </w:pPr>
-      <w:r>
-        <w:t>5. Webots execution</w:t>
-      </w:r>
-    </w:p>
-    <w:p>
-      <w:pPr>
-        <w:spacing w:before="100" w:after="60"/>
-      </w:pPr>
-      <w:r>
-        <w:rPr>
-          <w:rFonts w:ascii="Arial" w:hAnsi="Arial"/>
-          <w:b/>
-          <w:i w:val="0"/>
-          <w:color w:val="000000"/>
-          <w:sz w:val="22"/>
-        </w:rPr>
-        <w:t>Execution logs</w:t>
-      </w:r>
-    </w:p>
-    <w:tbl>
-      <w:tblPr>
-        <w:tblW w:type="dxa" w:w="9360"/>
-        <w:tblLayout w:type="fixed"/>
-        <w:tblLook w:firstColumn="1" w:firstRow="1" w:lastColumn="0" w:lastRow="0" w:noHBand="0" w:noVBand="1" w:val="04A0"/>
-        <w:tblInd w:w="0" w:type="dxa"/>
-        <w:tblBorders>
-          <w:top w:val="single" w:sz="4" w:color="DADCE0"/>
-          <w:left w:val="single" w:sz="4" w:color="DADCE0"/>
-          <w:bottom w:val="single" w:sz="4" w:color="DADCE0"/>
-          <w:right w:val="single" w:sz="4" w:color="DADCE0"/>
-          <w:insideH w:val="nil"/>
-          <w:insideV w:val="nil"/>
-        </w:tblBorders>
-      </w:tblPr>
-      <w:tblGrid>
-        <w:gridCol w:w="9360"/>
-      </w:tblGrid>
-      <w:tr>
-        <w:trPr>
-          <w:trHeight w:val="2592" w:hRule="atLeast"/>
-        </w:trPr>
-        <w:tc>
-          <w:tcPr>
-            <w:tcW w:type="dxa" w:w="9360"/>
-            <w:tcMar>
-              <w:top w:w="100" w:type="dxa"/>
-              <w:bottom w:w="100" w:type="dxa"/>
-              <w:start w:w="120" w:type="dxa"/>
-              <w:end w:w="120" w:type="dxa"/>
-            </w:tcMar>
-            <w:vAlign w:val="top"/>
-          </w:tcPr>
-          <w:p>
-            <w:pPr>
-              <w:spacing w:after="0"/>
-              <w:jc w:val="left"/>
-            </w:pPr>
-            <w:r>
-              <w:rPr>
-                <w:rFonts w:ascii="Consolas" w:hAnsi="Consolas"/>
-                <w:b w:val="0"/>
-                <w:i/>
-                <w:color w:val="555555"/>
-                <w:sz w:val="19"/>
-              </w:rPr>
-              <w:t>Paste the safety decision and repeated Target A and B execution results, including selected and measured q.</w:t>
-            </w:r>
-          </w:p>
-        </w:tc>
-      </w:tr>
-    </w:tbl>
-    <w:p>
-      <w:pPr>
-        <w:spacing w:before="100" w:after="60"/>
-      </w:pPr>
-      <w:r>
-        <w:rPr>
-          <w:rFonts w:ascii="Arial" w:hAnsi="Arial"/>
-          <w:b/>
-          <w:i w:val="0"/>
-          <w:color w:val="000000"/>
-          <w:sz w:val="22"/>
-        </w:rPr>
-        <w:t>Observation</w:t>
-      </w:r>
-    </w:p>
-    <w:tbl>
-      <w:tblPr>
-        <w:tblW w:type="dxa" w:w="9360"/>
-        <w:tblLayout w:type="fixed"/>
-        <w:tblLook w:firstColumn="1" w:firstRow="1" w:lastColumn="0" w:lastRow="0" w:noHBand="0" w:noVBand="1" w:val="04A0"/>
-        <w:tblInd w:w="0" w:type="dxa"/>
-        <w:tblBorders>
-          <w:top w:val="single" w:sz="4" w:color="DADCE0"/>
-          <w:left w:val="single" w:sz="4" w:color="DADCE0"/>
-          <w:bottom w:val="single" w:sz="4" w:color="DADCE0"/>
-          <w:right w:val="single" w:sz="4" w:color="DADCE0"/>
-          <w:insideH w:val="nil"/>
-          <w:insideV w:val="nil"/>
-        </w:tblBorders>
       </w:tblPr>
       <w:tblGrid>
         <w:gridCol w:w="9360"/>
@@ -956,269 +759,25 @@
         </w:trPr>
         <w:tc>
           <w:tcPr>
-            <w:tcW w:type="dxa" w:w="9360"/>
-            <w:tcMar>
-              <w:top w:w="100" w:type="dxa"/>
-              <w:bottom w:w="100" w:type="dxa"/>
-              <w:start w:w="120" w:type="dxa"/>
-              <w:end w:w="120" w:type="dxa"/>
-            </w:tcMar>
-            <w:vAlign w:val="top"/>
+            <w:tcW w:type="dxa" w:w="9288"/>
+            <w:vAlign w:val="center"/>
+            <w:tcBorders>
+              <w:top w:val="single" w:sz="8" w:color="D9D9D9"/>
+              <w:left w:val="single" w:sz="8" w:color="D9D9D9"/>
+              <w:bottom w:val="single" w:sz="8" w:color="D9D9D9"/>
+              <w:right w:val="single" w:sz="8" w:color="D9D9D9"/>
+            </w:tcBorders>
           </w:tcPr>
           <w:p>
             <w:pPr>
-              <w:spacing w:after="0"/>
               <w:jc w:val="left"/>
             </w:pPr>
             <w:r>
               <w:rPr>
                 <w:rFonts w:ascii="Arial" w:hAnsi="Arial"/>
-                <w:b w:val="0"/>
                 <w:i/>
-                <w:color w:val="555555"/>
-                <w:sz w:val="20"/>
-              </w:rPr>
-              <w:t>Note any visible difference between solutions or repeated trials.</w:t>
-            </w:r>
-          </w:p>
-        </w:tc>
-      </w:tr>
-    </w:tbl>
-    <w:p>
-      <w:r>
-        <w:br w:type="page"/>
-      </w:r>
-    </w:p>
-    <w:p>
-      <w:pPr>
-        <w:pStyle w:val="Heading1"/>
-      </w:pPr>
-      <w:r>
-        <w:t>6. Three-layer error analysis</w:t>
-      </w:r>
-    </w:p>
-    <w:p>
-      <w:pPr>
-        <w:spacing w:before="100" w:after="60"/>
-      </w:pPr>
-      <w:r>
-        <w:rPr>
-          <w:rFonts w:ascii="Arial" w:hAnsi="Arial"/>
-          <w:b/>
-          <w:i w:val="0"/>
-          <w:color w:val="000000"/>
-          <w:sz w:val="22"/>
-        </w:rPr>
-        <w:t>Error results</w:t>
-      </w:r>
-    </w:p>
-    <w:tbl>
-      <w:tblPr>
-        <w:tblW w:type="dxa" w:w="9360"/>
-        <w:tblLayout w:type="fixed"/>
-        <w:tblLook w:firstColumn="1" w:firstRow="1" w:lastColumn="0" w:lastRow="0" w:noHBand="0" w:noVBand="1" w:val="04A0"/>
-        <w:tblInd w:w="0" w:type="dxa"/>
-        <w:tblBorders>
-          <w:top w:val="single" w:sz="4" w:color="DADCE0"/>
-          <w:left w:val="single" w:sz="4" w:color="DADCE0"/>
-          <w:bottom w:val="single" w:sz="4" w:color="DADCE0"/>
-          <w:right w:val="single" w:sz="4" w:color="DADCE0"/>
-          <w:insideH w:val="nil"/>
-          <w:insideV w:val="nil"/>
-        </w:tblBorders>
-      </w:tblPr>
-      <w:tblGrid>
-        <w:gridCol w:w="9360"/>
-      </w:tblGrid>
-      <w:tr>
-        <w:trPr>
-          <w:trHeight w:val="2880" w:hRule="atLeast"/>
-        </w:trPr>
-        <w:tc>
-          <w:tcPr>
-            <w:tcW w:type="dxa" w:w="9360"/>
-            <w:tcMar>
-              <w:top w:w="100" w:type="dxa"/>
-              <w:bottom w:w="100" w:type="dxa"/>
-              <w:start w:w="120" w:type="dxa"/>
-              <w:end w:w="120" w:type="dxa"/>
-            </w:tcMar>
-            <w:vAlign w:val="top"/>
-          </w:tcPr>
-          <w:p>
-            <w:pPr>
-              <w:spacing w:after="0"/>
-              <w:jc w:val="left"/>
-            </w:pPr>
-            <w:r>
-              <w:rPr>
-                <w:rFonts w:ascii="Consolas" w:hAnsi="Consolas"/>
-                <w:b w:val="0"/>
-                <w:i/>
-                <w:color w:val="555555"/>
-                <w:sz w:val="19"/>
-              </w:rPr>
-              <w:t>Paste solver, measured-joint, and Webots position/orientation errors for every target and trial. Use millimeters and degrees.</w:t>
-            </w:r>
-          </w:p>
-        </w:tc>
-      </w:tr>
-    </w:tbl>
-    <w:p>
-      <w:pPr>
-        <w:spacing w:before="100" w:after="60"/>
-      </w:pPr>
-      <w:r>
-        <w:rPr>
-          <w:rFonts w:ascii="Arial" w:hAnsi="Arial"/>
-          <w:b/>
-          <w:i w:val="0"/>
-          <w:color w:val="000000"/>
-          <w:sz w:val="22"/>
-        </w:rPr>
-        <w:t>Interpretation</w:t>
-      </w:r>
-    </w:p>
-    <w:tbl>
-      <w:tblPr>
-        <w:tblW w:type="dxa" w:w="9360"/>
-        <w:tblLayout w:type="fixed"/>
-        <w:tblLook w:firstColumn="1" w:firstRow="1" w:lastColumn="0" w:lastRow="0" w:noHBand="0" w:noVBand="1" w:val="04A0"/>
-        <w:tblInd w:w="0" w:type="dxa"/>
-        <w:tblBorders>
-          <w:top w:val="single" w:sz="4" w:color="DADCE0"/>
-          <w:left w:val="single" w:sz="4" w:color="DADCE0"/>
-          <w:bottom w:val="single" w:sz="4" w:color="DADCE0"/>
-          <w:right w:val="single" w:sz="4" w:color="DADCE0"/>
-          <w:insideH w:val="nil"/>
-          <w:insideV w:val="nil"/>
-        </w:tblBorders>
-      </w:tblPr>
-      <w:tblGrid>
-        <w:gridCol w:w="9360"/>
-      </w:tblGrid>
-      <w:tr>
-        <w:trPr>
-          <w:trHeight w:val="1440" w:hRule="atLeast"/>
-        </w:trPr>
-        <w:tc>
-          <w:tcPr>
-            <w:tcW w:type="dxa" w:w="9360"/>
-            <w:tcMar>
-              <w:top w:w="100" w:type="dxa"/>
-              <w:bottom w:w="100" w:type="dxa"/>
-              <w:start w:w="120" w:type="dxa"/>
-              <w:end w:w="120" w:type="dxa"/>
-            </w:tcMar>
-            <w:vAlign w:val="top"/>
-          </w:tcPr>
-          <w:p>
-            <w:pPr>
-              <w:spacing w:after="0"/>
-              <w:jc w:val="left"/>
-            </w:pPr>
-            <w:r>
-              <w:rPr>
-                <w:rFonts w:ascii="Arial" w:hAnsi="Arial"/>
-                <w:b w:val="0"/>
-                <w:i/>
-                <w:color w:val="555555"/>
-                <w:sz w:val="20"/>
-              </w:rPr>
-              <w:t>Identify the dominant error layer. Compare seed-dependent solutions and state whether they are the same or different IK branches.</w:t>
-            </w:r>
-          </w:p>
-        </w:tc>
-      </w:tr>
-    </w:tbl>
-    <w:p>
-      <w:r>
-        <w:br w:type="page"/>
-      </w:r>
-    </w:p>
-    <w:p>
-      <w:pPr>
-        <w:pStyle w:val="Heading1"/>
-      </w:pPr>
-      <w:r>
-        <w:t>7. Engineering questions</w:t>
-      </w:r>
-    </w:p>
-    <w:p>
-      <w:pPr>
-        <w:spacing w:before="120" w:after="60"/>
-      </w:pPr>
-      <w:r>
-        <w:rPr>
-          <w:rFonts w:ascii="Arial" w:hAnsi="Arial"/>
-          <w:b/>
-          <w:i w:val="0"/>
-          <w:color w:val="000000"/>
-          <w:sz w:val="22"/>
-        </w:rPr>
-        <w:t>1. Why must IK reuse an already validated FK model?</w:t>
-      </w:r>
-    </w:p>
-    <w:p>
-      <w:pPr>
-        <w:spacing w:before="100" w:after="60"/>
-      </w:pPr>
-      <w:r>
-        <w:rPr>
-          <w:rFonts w:ascii="Arial" w:hAnsi="Arial"/>
-          <w:b/>
-          <w:i w:val="0"/>
-          <w:color w:val="000000"/>
-          <w:sz w:val="22"/>
-        </w:rPr>
-        <w:t>Answer</w:t>
-      </w:r>
-    </w:p>
-    <w:tbl>
-      <w:tblPr>
-        <w:tblW w:type="dxa" w:w="9360"/>
-        <w:tblLayout w:type="fixed"/>
-        <w:tblLook w:firstColumn="1" w:firstRow="1" w:lastColumn="0" w:lastRow="0" w:noHBand="0" w:noVBand="1" w:val="04A0"/>
-        <w:tblInd w:w="0" w:type="dxa"/>
-        <w:tblBorders>
-          <w:top w:val="single" w:sz="4" w:color="DADCE0"/>
-          <w:left w:val="single" w:sz="4" w:color="DADCE0"/>
-          <w:bottom w:val="single" w:sz="4" w:color="DADCE0"/>
-          <w:right w:val="single" w:sz="4" w:color="DADCE0"/>
-          <w:insideH w:val="nil"/>
-          <w:insideV w:val="nil"/>
-        </w:tblBorders>
-      </w:tblPr>
-      <w:tblGrid>
-        <w:gridCol w:w="9360"/>
-      </w:tblGrid>
-      <w:tr>
-        <w:trPr>
-          <w:trHeight w:val="936" w:hRule="atLeast"/>
-        </w:trPr>
-        <w:tc>
-          <w:tcPr>
-            <w:tcW w:type="dxa" w:w="9360"/>
-            <w:tcMar>
-              <w:top w:w="100" w:type="dxa"/>
-              <w:bottom w:w="100" w:type="dxa"/>
-              <w:start w:w="120" w:type="dxa"/>
-              <w:end w:w="120" w:type="dxa"/>
-            </w:tcMar>
-            <w:vAlign w:val="top"/>
-          </w:tcPr>
-          <w:p>
-            <w:pPr>
-              <w:spacing w:after="0"/>
-              <w:jc w:val="left"/>
-            </w:pPr>
-            <w:r>
-              <w:rPr>
-                <w:rFonts w:ascii="Arial" w:hAnsi="Arial"/>
-                <w:b w:val="0"/>
-                <w:i/>
-                <w:color w:val="555555"/>
-                <w:sz w:val="20"/>
+                <w:color w:val="595959"/>
+                <w:sz w:val="21"/>
               </w:rPr>
               <w:t>Type your answer here.</w:t>
             </w:r>
@@ -1228,79 +787,52 @@
     </w:tbl>
     <w:p>
       <w:pPr>
-        <w:spacing w:before="120" w:after="60"/>
+        <w:spacing w:after="0"/>
       </w:pPr>
+    </w:p>
+    <w:p>
       <w:r>
         <w:rPr>
           <w:rFonts w:ascii="Arial" w:hAnsi="Arial"/>
-          <w:b/>
-          <w:i w:val="0"/>
-          <w:color w:val="000000"/>
           <w:sz w:val="22"/>
         </w:rPr>
-        <w:t>2. Why can different seeds produce different joint vectors for one pose?</w:t>
-      </w:r>
-    </w:p>
-    <w:p>
-      <w:pPr>
-        <w:spacing w:before="100" w:after="60"/>
-      </w:pPr>
-      <w:r>
-        <w:rPr>
-          <w:rFonts w:ascii="Arial" w:hAnsi="Arial"/>
-          <w:b/>
-          <w:i w:val="0"/>
-          <w:color w:val="000000"/>
-          <w:sz w:val="22"/>
-        </w:rPr>
-        <w:t>Answer</w:t>
+        <w:t>2. Why is damping useful when the Jacobian is near a singular configuration?</w:t>
       </w:r>
     </w:p>
     <w:tbl>
       <w:tblPr>
-        <w:tblW w:type="dxa" w:w="9360"/>
+        <w:tblW w:type="auto" w:w="0"/>
         <w:tblLayout w:type="fixed"/>
         <w:tblLook w:firstColumn="1" w:firstRow="1" w:lastColumn="0" w:lastRow="0" w:noHBand="0" w:noVBand="1" w:val="04A0"/>
-        <w:tblInd w:w="0" w:type="dxa"/>
-        <w:tblBorders>
-          <w:top w:val="single" w:sz="4" w:color="DADCE0"/>
-          <w:left w:val="single" w:sz="4" w:color="DADCE0"/>
-          <w:bottom w:val="single" w:sz="4" w:color="DADCE0"/>
-          <w:right w:val="single" w:sz="4" w:color="DADCE0"/>
-          <w:insideH w:val="nil"/>
-          <w:insideV w:val="nil"/>
-        </w:tblBorders>
       </w:tblPr>
       <w:tblGrid>
         <w:gridCol w:w="9360"/>
       </w:tblGrid>
       <w:tr>
         <w:trPr>
-          <w:trHeight w:val="936" w:hRule="atLeast"/>
+          <w:trHeight w:val="1008" w:hRule="atLeast"/>
         </w:trPr>
         <w:tc>
           <w:tcPr>
-            <w:tcW w:type="dxa" w:w="9360"/>
-            <w:tcMar>
-              <w:top w:w="100" w:type="dxa"/>
-              <w:bottom w:w="100" w:type="dxa"/>
-              <w:start w:w="120" w:type="dxa"/>
-              <w:end w:w="120" w:type="dxa"/>
-            </w:tcMar>
-            <w:vAlign w:val="top"/>
+            <w:tcW w:type="dxa" w:w="9288"/>
+            <w:vAlign w:val="center"/>
+            <w:tcBorders>
+              <w:top w:val="single" w:sz="8" w:color="D9D9D9"/>
+              <w:left w:val="single" w:sz="8" w:color="D9D9D9"/>
+              <w:bottom w:val="single" w:sz="8" w:color="D9D9D9"/>
+              <w:right w:val="single" w:sz="8" w:color="D9D9D9"/>
+            </w:tcBorders>
           </w:tcPr>
           <w:p>
             <w:pPr>
-              <w:spacing w:after="0"/>
               <w:jc w:val="left"/>
             </w:pPr>
             <w:r>
               <w:rPr>
                 <w:rFonts w:ascii="Arial" w:hAnsi="Arial"/>
-                <w:b w:val="0"/>
                 <w:i/>
-                <w:color w:val="555555"/>
-                <w:sz w:val="20"/>
+                <w:color w:val="595959"/>
+                <w:sz w:val="21"/>
               </w:rPr>
               <w:t>Type your answer here.</w:t>
             </w:r>
@@ -1310,79 +842,52 @@
     </w:tbl>
     <w:p>
       <w:pPr>
-        <w:spacing w:before="120" w:after="60"/>
+        <w:spacing w:after="0"/>
       </w:pPr>
+    </w:p>
+    <w:p>
       <w:r>
         <w:rPr>
           <w:rFonts w:ascii="Arial" w:hAnsi="Arial"/>
-          <w:b/>
-          <w:i w:val="0"/>
-          <w:color w:val="000000"/>
           <w:sz w:val="22"/>
         </w:rPr>
-        <w:t>3. How do alpha, damping, and maximum joint step affect convergence?</w:t>
-      </w:r>
-    </w:p>
-    <w:p>
-      <w:pPr>
-        <w:spacing w:before="100" w:after="60"/>
-      </w:pPr>
-      <w:r>
-        <w:rPr>
-          <w:rFonts w:ascii="Arial" w:hAnsi="Arial"/>
-          <w:b/>
-          <w:i w:val="0"/>
-          <w:color w:val="000000"/>
-          <w:sz w:val="22"/>
-        </w:rPr>
-        <w:t>Answer</w:t>
+        <w:t>3. Why can two different initial joint seeds lead to different joint-angle solutions for the same tool pose?</w:t>
       </w:r>
     </w:p>
     <w:tbl>
       <w:tblPr>
-        <w:tblW w:type="dxa" w:w="9360"/>
+        <w:tblW w:type="auto" w:w="0"/>
         <w:tblLayout w:type="fixed"/>
         <w:tblLook w:firstColumn="1" w:firstRow="1" w:lastColumn="0" w:lastRow="0" w:noHBand="0" w:noVBand="1" w:val="04A0"/>
-        <w:tblInd w:w="0" w:type="dxa"/>
-        <w:tblBorders>
-          <w:top w:val="single" w:sz="4" w:color="DADCE0"/>
-          <w:left w:val="single" w:sz="4" w:color="DADCE0"/>
-          <w:bottom w:val="single" w:sz="4" w:color="DADCE0"/>
-          <w:right w:val="single" w:sz="4" w:color="DADCE0"/>
-          <w:insideH w:val="nil"/>
-          <w:insideV w:val="nil"/>
-        </w:tblBorders>
       </w:tblPr>
       <w:tblGrid>
         <w:gridCol w:w="9360"/>
       </w:tblGrid>
       <w:tr>
         <w:trPr>
-          <w:trHeight w:val="936" w:hRule="atLeast"/>
+          <w:trHeight w:val="1008" w:hRule="atLeast"/>
         </w:trPr>
         <w:tc>
           <w:tcPr>
-            <w:tcW w:type="dxa" w:w="9360"/>
-            <w:tcMar>
-              <w:top w:w="100" w:type="dxa"/>
-              <w:bottom w:w="100" w:type="dxa"/>
-              <w:start w:w="120" w:type="dxa"/>
-              <w:end w:w="120" w:type="dxa"/>
-            </w:tcMar>
-            <w:vAlign w:val="top"/>
+            <w:tcW w:type="dxa" w:w="9288"/>
+            <w:vAlign w:val="center"/>
+            <w:tcBorders>
+              <w:top w:val="single" w:sz="8" w:color="D9D9D9"/>
+              <w:left w:val="single" w:sz="8" w:color="D9D9D9"/>
+              <w:bottom w:val="single" w:sz="8" w:color="D9D9D9"/>
+              <w:right w:val="single" w:sz="8" w:color="D9D9D9"/>
+            </w:tcBorders>
           </w:tcPr>
           <w:p>
             <w:pPr>
-              <w:spacing w:after="0"/>
               <w:jc w:val="left"/>
             </w:pPr>
             <w:r>
               <w:rPr>
                 <w:rFonts w:ascii="Arial" w:hAnsi="Arial"/>
-                <w:b w:val="0"/>
                 <w:i/>
-                <w:color w:val="555555"/>
-                <w:sz w:val="20"/>
+                <w:color w:val="595959"/>
+                <w:sz w:val="21"/>
               </w:rPr>
               <w:t>Type your answer here.</w:t>
             </w:r>
@@ -1392,355 +897,24 @@
     </w:tbl>
     <w:p>
       <w:pPr>
-        <w:spacing w:before="120" w:after="60"/>
+        <w:spacing w:after="0"/>
       </w:pPr>
+    </w:p>
+    <w:p>
       <w:r>
         <w:rPr>
           <w:rFonts w:ascii="Arial" w:hAnsi="Arial"/>
           <w:b/>
-          <w:i w:val="0"/>
-          <w:color w:val="000000"/>
           <w:sz w:val="22"/>
         </w:rPr>
-        <w:t>4. Why are position and orientation tolerances checked separately?</w:t>
-      </w:r>
-    </w:p>
-    <w:p>
-      <w:pPr>
-        <w:spacing w:before="100" w:after="60"/>
-      </w:pPr>
-      <w:r>
-        <w:rPr>
-          <w:rFonts w:ascii="Arial" w:hAnsi="Arial"/>
-          <w:b/>
-          <w:i w:val="0"/>
-          <w:color w:val="000000"/>
-          <w:sz w:val="22"/>
-        </w:rPr>
-        <w:t>Answer</w:t>
-      </w:r>
-    </w:p>
-    <w:tbl>
-      <w:tblPr>
-        <w:tblW w:type="dxa" w:w="9360"/>
-        <w:tblLayout w:type="fixed"/>
-        <w:tblLook w:firstColumn="1" w:firstRow="1" w:lastColumn="0" w:lastRow="0" w:noHBand="0" w:noVBand="1" w:val="04A0"/>
-        <w:tblInd w:w="0" w:type="dxa"/>
-        <w:tblBorders>
-          <w:top w:val="single" w:sz="4" w:color="DADCE0"/>
-          <w:left w:val="single" w:sz="4" w:color="DADCE0"/>
-          <w:bottom w:val="single" w:sz="4" w:color="DADCE0"/>
-          <w:right w:val="single" w:sz="4" w:color="DADCE0"/>
-          <w:insideH w:val="nil"/>
-          <w:insideV w:val="nil"/>
-        </w:tblBorders>
-      </w:tblPr>
-      <w:tblGrid>
-        <w:gridCol w:w="9360"/>
-      </w:tblGrid>
-      <w:tr>
-        <w:trPr>
-          <w:trHeight w:val="936" w:hRule="atLeast"/>
-        </w:trPr>
-        <w:tc>
-          <w:tcPr>
-            <w:tcW w:type="dxa" w:w="9360"/>
-            <w:tcMar>
-              <w:top w:w="100" w:type="dxa"/>
-              <w:bottom w:w="100" w:type="dxa"/>
-              <w:start w:w="120" w:type="dxa"/>
-              <w:end w:w="120" w:type="dxa"/>
-            </w:tcMar>
-            <w:vAlign w:val="top"/>
-          </w:tcPr>
-          <w:p>
-            <w:pPr>
-              <w:spacing w:after="0"/>
-              <w:jc w:val="left"/>
-            </w:pPr>
-            <w:r>
-              <w:rPr>
-                <w:rFonts w:ascii="Arial" w:hAnsi="Arial"/>
-                <w:b w:val="0"/>
-                <w:i/>
-                <w:color w:val="555555"/>
-                <w:sz w:val="20"/>
-              </w:rPr>
-              <w:t>Type your answer here.</w:t>
-            </w:r>
-          </w:p>
-        </w:tc>
-      </w:tr>
-    </w:tbl>
-    <w:p>
-      <w:pPr>
-        <w:spacing w:before="120" w:after="60"/>
-      </w:pPr>
-      <w:r>
-        <w:rPr>
-          <w:rFonts w:ascii="Arial" w:hAnsi="Arial"/>
-          <w:b/>
-          <w:i w:val="0"/>
-          <w:color w:val="000000"/>
-          <w:sz w:val="22"/>
-        </w:rPr>
-        <w:t>5. Why does endpoint convergence not guarantee safe execution?</w:t>
-      </w:r>
-    </w:p>
-    <w:p>
-      <w:pPr>
-        <w:spacing w:before="100" w:after="60"/>
-      </w:pPr>
-      <w:r>
-        <w:rPr>
-          <w:rFonts w:ascii="Arial" w:hAnsi="Arial"/>
-          <w:b/>
-          <w:i w:val="0"/>
-          <w:color w:val="000000"/>
-          <w:sz w:val="22"/>
-        </w:rPr>
-        <w:t>Answer</w:t>
-      </w:r>
-    </w:p>
-    <w:tbl>
-      <w:tblPr>
-        <w:tblW w:type="dxa" w:w="9360"/>
-        <w:tblLayout w:type="fixed"/>
-        <w:tblLook w:firstColumn="1" w:firstRow="1" w:lastColumn="0" w:lastRow="0" w:noHBand="0" w:noVBand="1" w:val="04A0"/>
-        <w:tblInd w:w="0" w:type="dxa"/>
-        <w:tblBorders>
-          <w:top w:val="single" w:sz="4" w:color="DADCE0"/>
-          <w:left w:val="single" w:sz="4" w:color="DADCE0"/>
-          <w:bottom w:val="single" w:sz="4" w:color="DADCE0"/>
-          <w:right w:val="single" w:sz="4" w:color="DADCE0"/>
-          <w:insideH w:val="nil"/>
-          <w:insideV w:val="nil"/>
-        </w:tblBorders>
-      </w:tblPr>
-      <w:tblGrid>
-        <w:gridCol w:w="9360"/>
-      </w:tblGrid>
-      <w:tr>
-        <w:trPr>
-          <w:trHeight w:val="936" w:hRule="atLeast"/>
-        </w:trPr>
-        <w:tc>
-          <w:tcPr>
-            <w:tcW w:type="dxa" w:w="9360"/>
-            <w:tcMar>
-              <w:top w:w="100" w:type="dxa"/>
-              <w:bottom w:w="100" w:type="dxa"/>
-              <w:start w:w="120" w:type="dxa"/>
-              <w:end w:w="120" w:type="dxa"/>
-            </w:tcMar>
-            <w:vAlign w:val="top"/>
-          </w:tcPr>
-          <w:p>
-            <w:pPr>
-              <w:spacing w:after="0"/>
-              <w:jc w:val="left"/>
-            </w:pPr>
-            <w:r>
-              <w:rPr>
-                <w:rFonts w:ascii="Arial" w:hAnsi="Arial"/>
-                <w:b w:val="0"/>
-                <w:i/>
-                <w:color w:val="555555"/>
-                <w:sz w:val="20"/>
-              </w:rPr>
-              <w:t>Type your answer here.</w:t>
-            </w:r>
-          </w:p>
-        </w:tc>
-      </w:tr>
-    </w:tbl>
-    <w:p>
-      <w:pPr>
-        <w:spacing w:before="120" w:after="60"/>
-      </w:pPr>
-      <w:r>
-        <w:rPr>
-          <w:rFonts w:ascii="Arial" w:hAnsi="Arial"/>
-          <w:b/>
-          <w:i w:val="0"/>
-          <w:color w:val="000000"/>
-          <w:sz w:val="22"/>
-        </w:rPr>
-        <w:t>6. How does an unreachable-target residual history differ from convergence?</w:t>
-      </w:r>
-    </w:p>
-    <w:p>
-      <w:pPr>
-        <w:spacing w:before="100" w:after="60"/>
-      </w:pPr>
-      <w:r>
-        <w:rPr>
-          <w:rFonts w:ascii="Arial" w:hAnsi="Arial"/>
-          <w:b/>
-          <w:i w:val="0"/>
-          <w:color w:val="000000"/>
-          <w:sz w:val="22"/>
-        </w:rPr>
-        <w:t>Answer</w:t>
-      </w:r>
-    </w:p>
-    <w:tbl>
-      <w:tblPr>
-        <w:tblW w:type="dxa" w:w="9360"/>
-        <w:tblLayout w:type="fixed"/>
-        <w:tblLook w:firstColumn="1" w:firstRow="1" w:lastColumn="0" w:lastRow="0" w:noHBand="0" w:noVBand="1" w:val="04A0"/>
-        <w:tblInd w:w="0" w:type="dxa"/>
-        <w:tblBorders>
-          <w:top w:val="single" w:sz="4" w:color="DADCE0"/>
-          <w:left w:val="single" w:sz="4" w:color="DADCE0"/>
-          <w:bottom w:val="single" w:sz="4" w:color="DADCE0"/>
-          <w:right w:val="single" w:sz="4" w:color="DADCE0"/>
-          <w:insideH w:val="nil"/>
-          <w:insideV w:val="nil"/>
-        </w:tblBorders>
-      </w:tblPr>
-      <w:tblGrid>
-        <w:gridCol w:w="9360"/>
-      </w:tblGrid>
-      <w:tr>
-        <w:trPr>
-          <w:trHeight w:val="936" w:hRule="atLeast"/>
-        </w:trPr>
-        <w:tc>
-          <w:tcPr>
-            <w:tcW w:type="dxa" w:w="9360"/>
-            <w:tcMar>
-              <w:top w:w="100" w:type="dxa"/>
-              <w:bottom w:w="100" w:type="dxa"/>
-              <w:start w:w="120" w:type="dxa"/>
-              <w:end w:w="120" w:type="dxa"/>
-            </w:tcMar>
-            <w:vAlign w:val="top"/>
-          </w:tcPr>
-          <w:p>
-            <w:pPr>
-              <w:spacing w:after="0"/>
-              <w:jc w:val="left"/>
-            </w:pPr>
-            <w:r>
-              <w:rPr>
-                <w:rFonts w:ascii="Arial" w:hAnsi="Arial"/>
-                <w:b w:val="0"/>
-                <w:i/>
-                <w:color w:val="555555"/>
-                <w:sz w:val="20"/>
-              </w:rPr>
-              <w:t>Type your answer here.</w:t>
-            </w:r>
-          </w:p>
-        </w:tc>
-      </w:tr>
-    </w:tbl>
-    <w:p>
-      <w:pPr>
-        <w:spacing w:before="120" w:after="60"/>
-      </w:pPr>
-      <w:r>
-        <w:rPr>
-          <w:rFonts w:ascii="Arial" w:hAnsi="Arial"/>
-          <w:b/>
-          <w:i w:val="0"/>
-          <w:color w:val="000000"/>
-          <w:sz w:val="22"/>
-        </w:rPr>
-        <w:t>7. How do the three error layers locate a problem?</w:t>
-      </w:r>
-    </w:p>
-    <w:p>
-      <w:pPr>
-        <w:spacing w:before="100" w:after="60"/>
-      </w:pPr>
-      <w:r>
-        <w:rPr>
-          <w:rFonts w:ascii="Arial" w:hAnsi="Arial"/>
-          <w:b/>
-          <w:i w:val="0"/>
-          <w:color w:val="000000"/>
-          <w:sz w:val="22"/>
-        </w:rPr>
-        <w:t>Answer</w:t>
-      </w:r>
-    </w:p>
-    <w:tbl>
-      <w:tblPr>
-        <w:tblW w:type="dxa" w:w="9360"/>
-        <w:tblLayout w:type="fixed"/>
-        <w:tblLook w:firstColumn="1" w:firstRow="1" w:lastColumn="0" w:lastRow="0" w:noHBand="0" w:noVBand="1" w:val="04A0"/>
-        <w:tblInd w:w="0" w:type="dxa"/>
-        <w:tblBorders>
-          <w:top w:val="single" w:sz="4" w:color="DADCE0"/>
-          <w:left w:val="single" w:sz="4" w:color="DADCE0"/>
-          <w:bottom w:val="single" w:sz="4" w:color="DADCE0"/>
-          <w:right w:val="single" w:sz="4" w:color="DADCE0"/>
-          <w:insideH w:val="nil"/>
-          <w:insideV w:val="nil"/>
-        </w:tblBorders>
-      </w:tblPr>
-      <w:tblGrid>
-        <w:gridCol w:w="9360"/>
-      </w:tblGrid>
-      <w:tr>
-        <w:trPr>
-          <w:trHeight w:val="936" w:hRule="atLeast"/>
-        </w:trPr>
-        <w:tc>
-          <w:tcPr>
-            <w:tcW w:type="dxa" w:w="9360"/>
-            <w:tcMar>
-              <w:top w:w="100" w:type="dxa"/>
-              <w:bottom w:w="100" w:type="dxa"/>
-              <w:start w:w="120" w:type="dxa"/>
-              <w:end w:w="120" w:type="dxa"/>
-            </w:tcMar>
-            <w:vAlign w:val="top"/>
-          </w:tcPr>
-          <w:p>
-            <w:pPr>
-              <w:spacing w:after="0"/>
-              <w:jc w:val="left"/>
-            </w:pPr>
-            <w:r>
-              <w:rPr>
-                <w:rFonts w:ascii="Arial" w:hAnsi="Arial"/>
-                <w:b w:val="0"/>
-                <w:i/>
-                <w:color w:val="555555"/>
-                <w:sz w:val="20"/>
-              </w:rPr>
-              <w:t>Type your answer here.</w:t>
-            </w:r>
-          </w:p>
-        </w:tc>
-      </w:tr>
-    </w:tbl>
-    <w:p>
-      <w:pPr>
-        <w:spacing w:before="240" w:after="0"/>
-      </w:pPr>
-      <w:r>
-        <w:rPr>
-          <w:rFonts w:ascii="Arial" w:hAnsi="Arial"/>
-          <w:b/>
-          <w:i w:val="0"/>
-          <w:color w:val="000000"/>
-          <w:sz w:val="22"/>
-        </w:rPr>
-        <w:t xml:space="preserve">Before submitting: </w:t>
+        <w:t>Before submitting:</w:t>
       </w:r>
       <w:r>
         <w:rPr>
           <w:rFonts w:ascii="Arial" w:hAnsi="Arial"/>
-          <w:b w:val="0"/>
-          <w:i w:val="0"/>
-          <w:color w:val="000000"/>
           <w:sz w:val="22"/>
         </w:rPr>
-        <w:t>Check that your name, requested output, figures, and explanations are included, then save the file as .docx.</w:t>
+        <w:t xml:space="preserve"> Check that your name, two equation lines, all three offline results, both Webots outputs, two screenshots, pose-by-pose comparisons, and three answers are included. Save the file as .docx.</w:t>
       </w:r>
     </w:p>
     <w:sectPr>

</xml_diff>

<commit_message>
Update Lab03 report template and README for three IK equations
</commit_message>
<xml_diff>
--- a/lab03_inverse_kinematics/Lab03_Report_Template.docx
+++ b/lab03_inverse_kinematics/Lab03_Report_Template.docx
@@ -98,10 +98,7 @@
         <w:spacing w:before="160" w:after="160"/>
       </w:pPr>
       <w:r>
-        <w:rPr>
-          <w:rFonts w:ascii="Arial" w:hAnsi="Arial"/>
-        </w:rPr>
-        <w:t>Directions: Open this template in Microsoft Word and use File &gt; Save As to create LastName_Lab03_Report.docx. Complete the two equation lines in the source file, then paste the requested offline and Webots outputs below. Replace each prompt with your own results and insert the two requested screenshots.</w:t>
+        <w:t>Directions: Open this template in Microsoft Word and use File &gt; Save As to create LastName_Lab03_Report.docx. Complete the three equation lines in the source file, then paste the requested offline and Webots outputs below. Replace each prompt with your own results and insert the two requested screenshots.</w:t>
       </w:r>
     </w:p>
     <w:p>
@@ -118,20 +115,63 @@
     </w:p>
     <w:p>
       <w:r>
-        <w:rPr>
-          <w:rFonts w:ascii="Arial" w:hAnsi="Arial"/>
-          <w:sz w:val="22"/>
-        </w:rPr>
-        <w:t>Enter the two Python lines you placed at TODO 1 and TODO 2 in src/numerical_ik.py.</w:t>
+        <w:t>Enter the three Python lines you placed at TODO 1, TODO 2, and TODO 3 in src/numerical_ik.py.</w:t>
       </w:r>
     </w:p>
     <w:p>
       <w:r>
-        <w:rPr>
-          <w:rFonts w:ascii="Arial" w:hAnsi="Arial"/>
-          <w:sz w:val="22"/>
-        </w:rPr>
-        <w:t>TODO 1  Damped least squares</w:t>
+        <w:t>TODO 1  Position error</w:t>
+      </w:r>
+    </w:p>
+    <w:tbl>
+      <w:tblPr>
+        <w:tblW w:type="auto" w:w="0"/>
+        <w:tblLayout w:type="fixed"/>
+        <w:tblLook w:firstColumn="1" w:firstRow="1" w:lastColumn="0" w:lastRow="0" w:noHBand="0" w:noVBand="1" w:val="04A0"/>
+      </w:tblPr>
+      <w:tblGrid>
+        <w:gridCol w:w="9360"/>
+      </w:tblGrid>
+      <w:tr>
+        <w:trPr>
+          <w:trHeight w:val="792" w:hRule="atLeast"/>
+        </w:trPr>
+        <w:tc>
+          <w:tcPr>
+            <w:tcW w:type="dxa" w:w="9288"/>
+            <w:vAlign w:val="center"/>
+            <w:tcBorders>
+              <w:top w:val="single" w:sz="8" w:color="D9D9D9"/>
+              <w:left w:val="single" w:sz="8" w:color="D9D9D9"/>
+              <w:bottom w:val="single" w:sz="8" w:color="D9D9D9"/>
+              <w:right w:val="single" w:sz="8" w:color="D9D9D9"/>
+            </w:tcBorders>
+          </w:tcPr>
+          <w:p>
+            <w:pPr>
+              <w:jc w:val="left"/>
+            </w:pPr>
+            <w:r>
+              <w:rPr>
+                <w:rFonts w:ascii="Arial" w:hAnsi="Arial"/>
+                <w:i/>
+                <w:color w:val="595959"/>
+                <w:sz w:val="21"/>
+              </w:rPr>
+              <w:t>Paste the completed position = ... line here.</w:t>
+            </w:r>
+          </w:p>
+        </w:tc>
+      </w:tr>
+    </w:tbl>
+    <w:p>
+      <w:pPr>
+        <w:spacing w:after="0"/>
+      </w:pPr>
+    </w:p>
+    <w:p>
+      <w:r>
+        <w:t>TODO 2  Damped least squares</w:t>
       </w:r>
     </w:p>
     <w:tbl>
@@ -182,11 +222,7 @@
     </w:p>
     <w:p>
       <w:r>
-        <w:rPr>
-          <w:rFonts w:ascii="Arial" w:hAnsi="Arial"/>
-          <w:sz w:val="22"/>
-        </w:rPr>
-        <w:t>TODO 2  Joint update</w:t>
+        <w:t>TODO 3  Joint update</w:t>
       </w:r>
     </w:p>
     <w:tbl>
@@ -230,11 +266,7 @@
         </w:tc>
       </w:tr>
     </w:tbl>
-    <w:p>
-      <w:pPr>
-        <w:spacing w:after="0"/>
-      </w:pPr>
-    </w:p>
+    <w:p/>
     <w:p>
       <w:pPr>
         <w:pStyle w:val="Heading1"/>
@@ -901,20 +933,15 @@
       </w:pPr>
     </w:p>
     <w:p>
+      <w:r/>
       <w:r>
         <w:rPr>
-          <w:rFonts w:ascii="Arial" w:hAnsi="Arial"/>
           <w:b/>
-          <w:sz w:val="22"/>
         </w:rPr>
         <w:t>Before submitting:</w:t>
       </w:r>
       <w:r>
-        <w:rPr>
-          <w:rFonts w:ascii="Arial" w:hAnsi="Arial"/>
-          <w:sz w:val="22"/>
-        </w:rPr>
-        <w:t xml:space="preserve"> Check that your name, two equation lines, all three offline results, both Webots outputs, two screenshots, pose-by-pose comparisons, and three answers are included. Save the file as .docx.</w:t>
+        <w:t xml:space="preserve"> Check that your name, three equation lines, all three offline results, both Webots outputs, two screenshots, pose-by-pose comparisons, and three answers are included. Save the file as .docx.</w:t>
       </w:r>
     </w:p>
     <w:sectPr>

</xml_diff>

<commit_message>
Update Lab03 report template and README for clarity and consistency in instructions
</commit_message>
<xml_diff>
--- a/lab03_inverse_kinematics/Lab03_Report_Template.docx
+++ b/lab03_inverse_kinematics/Lab03_Report_Template.docx
@@ -282,11 +282,7 @@
     </w:p>
     <w:p>
       <w:r>
-        <w:rPr>
-          <w:rFonts w:ascii="Arial" w:hAnsi="Arial"/>
-          <w:sz w:val="22"/>
-        </w:rPr>
-        <w:t>Run the provided offline experiment. Paste the complete console output for Target A, Target B, and the unreachable target.</w:t>
+        <w:t>Run the provided offline experiment. Paste the complete console output for Target A and Target B.</w:t>
       </w:r>
     </w:p>
     <w:tbl>
@@ -300,7 +296,7 @@
       </w:tblGrid>
       <w:tr>
         <w:trPr>
-          <w:trHeight w:val="4464" w:hRule="atLeast"/>
+          <w:trHeight w:val="6120" w:hRule="atLeast"/>
         </w:trPr>
         <w:tc>
           <w:tcPr>
@@ -318,13 +314,7 @@
               <w:jc w:val="left"/>
             </w:pPr>
             <w:r>
-              <w:rPr>
-                <w:rFonts w:ascii="Arial" w:hAnsi="Arial"/>
-                <w:i/>
-                <w:color w:val="595959"/>
-                <w:sz w:val="21"/>
-              </w:rPr>
-              <w:t>Paste the complete output from run_ik_experiments.py here.</w:t>
+              <w:t>Paste the Target A and Target B sections from run_ik_experiments.py here.</w:t>
             </w:r>
           </w:p>
         </w:tc>
@@ -335,56 +325,6 @@
         <w:spacing w:after="0"/>
       </w:pPr>
     </w:p>
-    <w:p>
-      <w:r>
-        <w:rPr>
-          <w:rFonts w:ascii="Arial" w:hAnsi="Arial"/>
-          <w:sz w:val="22"/>
-        </w:rPr>
-        <w:t>In one or two sentences, explain why converged = False is the correct result for the unreachable target.</w:t>
-      </w:r>
-    </w:p>
-    <w:tbl>
-      <w:tblPr>
-        <w:tblW w:type="auto" w:w="0"/>
-        <w:tblLayout w:type="fixed"/>
-        <w:tblLook w:firstColumn="1" w:firstRow="1" w:lastColumn="0" w:lastRow="0" w:noHBand="0" w:noVBand="1" w:val="04A0"/>
-      </w:tblPr>
-      <w:tblGrid>
-        <w:gridCol w:w="9360"/>
-      </w:tblGrid>
-      <w:tr>
-        <w:trPr>
-          <w:trHeight w:val="1296" w:hRule="atLeast"/>
-        </w:trPr>
-        <w:tc>
-          <w:tcPr>
-            <w:tcW w:type="dxa" w:w="9288"/>
-            <w:vAlign w:val="center"/>
-            <w:tcBorders>
-              <w:top w:val="single" w:sz="8" w:color="D9D9D9"/>
-              <w:left w:val="single" w:sz="8" w:color="D9D9D9"/>
-              <w:bottom w:val="single" w:sz="8" w:color="D9D9D9"/>
-              <w:right w:val="single" w:sz="8" w:color="D9D9D9"/>
-            </w:tcBorders>
-          </w:tcPr>
-          <w:p>
-            <w:pPr>
-              <w:jc w:val="left"/>
-            </w:pPr>
-            <w:r>
-              <w:rPr>
-                <w:rFonts w:ascii="Arial" w:hAnsi="Arial"/>
-                <w:i/>
-                <w:color w:val="595959"/>
-                <w:sz w:val="21"/>
-              </w:rPr>
-              <w:t>Type your explanation here.</w:t>
-            </w:r>
-          </w:p>
-        </w:tc>
-      </w:tr>
-    </w:tbl>
     <w:p>
       <w:pPr>
         <w:spacing w:after="0"/>
@@ -760,20 +700,12 @@
         <w:pageBreakBefore/>
       </w:pPr>
       <w:r>
-        <w:rPr>
-          <w:rFonts w:ascii="Arial" w:hAnsi="Arial"/>
-          <w:color w:val="000000"/>
-        </w:rPr>
-        <w:t>5. Engineering questions</w:t>
+        <w:t>5. Engineering question</w:t>
       </w:r>
     </w:p>
     <w:p>
       <w:r>
-        <w:rPr>
-          <w:rFonts w:ascii="Arial" w:hAnsi="Arial"/>
-          <w:sz w:val="22"/>
-        </w:rPr>
-        <w:t>1. In one iteration, how does the pose-error vector influence the joint correction?</w:t>
+        <w:t>In one numerical IK iteration, explain how the pose-error vector, the damped Jacobian correction, and the joint update work together to move the tool toward the desired pose.</w:t>
       </w:r>
     </w:p>
     <w:tbl>
@@ -787,12 +719,12 @@
       </w:tblGrid>
       <w:tr>
         <w:trPr>
-          <w:trHeight w:val="1008" w:hRule="atLeast"/>
+          <w:trHeight w:val="1944" w:hRule="atLeast"/>
         </w:trPr>
         <w:tc>
           <w:tcPr>
             <w:tcW w:type="dxa" w:w="9288"/>
-            <w:vAlign w:val="center"/>
+            <w:vAlign w:val="top"/>
             <w:tcBorders>
               <w:top w:val="single" w:sz="8" w:color="D9D9D9"/>
               <w:left w:val="single" w:sz="8" w:color="D9D9D9"/>
@@ -823,55 +755,10 @@
       </w:pPr>
     </w:p>
     <w:p>
-      <w:r>
-        <w:rPr>
-          <w:rFonts w:ascii="Arial" w:hAnsi="Arial"/>
-          <w:sz w:val="22"/>
-        </w:rPr>
-        <w:t>2. Why is damping useful when the Jacobian is near a singular configuration?</w:t>
-      </w:r>
+      <w:pPr>
+        <w:spacing w:after="0"/>
+      </w:pPr>
     </w:p>
-    <w:tbl>
-      <w:tblPr>
-        <w:tblW w:type="auto" w:w="0"/>
-        <w:tblLayout w:type="fixed"/>
-        <w:tblLook w:firstColumn="1" w:firstRow="1" w:lastColumn="0" w:lastRow="0" w:noHBand="0" w:noVBand="1" w:val="04A0"/>
-      </w:tblPr>
-      <w:tblGrid>
-        <w:gridCol w:w="9360"/>
-      </w:tblGrid>
-      <w:tr>
-        <w:trPr>
-          <w:trHeight w:val="1008" w:hRule="atLeast"/>
-        </w:trPr>
-        <w:tc>
-          <w:tcPr>
-            <w:tcW w:type="dxa" w:w="9288"/>
-            <w:vAlign w:val="center"/>
-            <w:tcBorders>
-              <w:top w:val="single" w:sz="8" w:color="D9D9D9"/>
-              <w:left w:val="single" w:sz="8" w:color="D9D9D9"/>
-              <w:bottom w:val="single" w:sz="8" w:color="D9D9D9"/>
-              <w:right w:val="single" w:sz="8" w:color="D9D9D9"/>
-            </w:tcBorders>
-          </w:tcPr>
-          <w:p>
-            <w:pPr>
-              <w:jc w:val="left"/>
-            </w:pPr>
-            <w:r>
-              <w:rPr>
-                <w:rFonts w:ascii="Arial" w:hAnsi="Arial"/>
-                <w:i/>
-                <w:color w:val="595959"/>
-                <w:sz w:val="21"/>
-              </w:rPr>
-              <w:t>Type your answer here.</w:t>
-            </w:r>
-          </w:p>
-        </w:tc>
-      </w:tr>
-    </w:tbl>
     <w:p>
       <w:pPr>
         <w:spacing w:after="0"/>
@@ -880,68 +767,12 @@
     <w:p>
       <w:r>
         <w:rPr>
-          <w:rFonts w:ascii="Arial" w:hAnsi="Arial"/>
-          <w:sz w:val="22"/>
-        </w:rPr>
-        <w:t>3. Why can two different initial joint seeds lead to different joint-angle solutions for the same tool pose?</w:t>
-      </w:r>
-    </w:p>
-    <w:tbl>
-      <w:tblPr>
-        <w:tblW w:type="auto" w:w="0"/>
-        <w:tblLayout w:type="fixed"/>
-        <w:tblLook w:firstColumn="1" w:firstRow="1" w:lastColumn="0" w:lastRow="0" w:noHBand="0" w:noVBand="1" w:val="04A0"/>
-      </w:tblPr>
-      <w:tblGrid>
-        <w:gridCol w:w="9360"/>
-      </w:tblGrid>
-      <w:tr>
-        <w:trPr>
-          <w:trHeight w:val="1008" w:hRule="atLeast"/>
-        </w:trPr>
-        <w:tc>
-          <w:tcPr>
-            <w:tcW w:type="dxa" w:w="9288"/>
-            <w:vAlign w:val="center"/>
-            <w:tcBorders>
-              <w:top w:val="single" w:sz="8" w:color="D9D9D9"/>
-              <w:left w:val="single" w:sz="8" w:color="D9D9D9"/>
-              <w:bottom w:val="single" w:sz="8" w:color="D9D9D9"/>
-              <w:right w:val="single" w:sz="8" w:color="D9D9D9"/>
-            </w:tcBorders>
-          </w:tcPr>
-          <w:p>
-            <w:pPr>
-              <w:jc w:val="left"/>
-            </w:pPr>
-            <w:r>
-              <w:rPr>
-                <w:rFonts w:ascii="Arial" w:hAnsi="Arial"/>
-                <w:i/>
-                <w:color w:val="595959"/>
-                <w:sz w:val="21"/>
-              </w:rPr>
-              <w:t>Type your answer here.</w:t>
-            </w:r>
-          </w:p>
-        </w:tc>
-      </w:tr>
-    </w:tbl>
-    <w:p>
-      <w:pPr>
-        <w:spacing w:after="0"/>
-      </w:pPr>
-    </w:p>
-    <w:p>
-      <w:r/>
-      <w:r>
-        <w:rPr>
           <w:b/>
         </w:rPr>
         <w:t>Before submitting:</w:t>
       </w:r>
       <w:r>
-        <w:t xml:space="preserve"> Check that your name, three equation lines, all three offline results, both Webots outputs, two screenshots, pose-by-pose comparisons, and three answers are included. Save the file as .docx.</w:t>
+        <w:t xml:space="preserve"> Check that your name, three equation lines, both offline results, both Webots outputs, two screenshots, the pose-by-pose comparisons, and your response to the Engineering Question are included. Save the file as .docx.</w:t>
       </w:r>
     </w:p>
     <w:sectPr>

</xml_diff>